<commit_message>
Deploying to gh-pages from @ Morrison-Lab/psc@03bc35340019797c1daf0495fffcb09d6ae963db 🚀
</commit_message>
<xml_diff>
--- a/chapters/big-data.docx
+++ b/chapters/big-data.docx
@@ -15,10 +15,10 @@
         <w:pStyle w:val="Date"/>
       </w:pPr>
       <w:r>
-        <w:t xml:space="preserve">Last modified: 2026-10-12 00:36:52 (PDT)</w:t>
+        <w:t xml:space="preserve">Last modified: 2026-10-12 01:04:11 (PDT)</w:t>
       </w:r>
     </w:p>
-    <w:bookmarkStart w:id="10" w:name="the-data.table-package"/>
+    <w:bookmarkStart w:id="10" w:name="sec-the-data-table-package"/>
     <w:p>
       <w:pPr>
         <w:pStyle w:val="Heading2"/>
@@ -379,7 +379,7 @@
       </w:r>
     </w:p>
     <w:bookmarkEnd w:id="10"/>
-    <w:bookmarkStart w:id="11" w:name="using-downsampled-data"/>
+    <w:bookmarkStart w:id="11" w:name="sec-using-downsampled-data"/>
     <w:p>
       <w:pPr>
         <w:pStyle w:val="Heading2"/>
@@ -409,7 +409,7 @@
       </w:r>
     </w:p>
     <w:bookmarkEnd w:id="11"/>
-    <w:bookmarkStart w:id="12" w:name="optimal-rstudio-set-up"/>
+    <w:bookmarkStart w:id="12" w:name="sec-optimal-rstudio-set-up"/>
     <w:p>
       <w:pPr>
         <w:pStyle w:val="Heading2"/>

</xml_diff>

<commit_message>
Deploying to gh-pages from @ Morrison-Lab/psc@6391e189e4190e741733c0e31a90ec13e99d9e73 🚀
</commit_message>
<xml_diff>
--- a/chapters/big-data.docx
+++ b/chapters/big-data.docx
@@ -15,10 +15,10 @@
         <w:pStyle w:val="Date"/>
       </w:pPr>
       <w:r>
-        <w:t xml:space="preserve">Last modified: 2026-10-14 02:01:49 (PDT)</w:t>
+        <w:t xml:space="preserve">Last modified: 2026-10-14 03:08:22 (PDT)</w:t>
       </w:r>
     </w:p>
-    <w:bookmarkStart w:id="10" w:name="sec-the-data-table-package"/>
+    <w:bookmarkStart w:id="11" w:name="sec-the-data-table-package"/>
     <w:p>
       <w:pPr>
         <w:pStyle w:val="Heading2"/>
@@ -32,22 +32,34 @@
         <w:pStyle w:val="FirstParagraph"/>
       </w:pPr>
       <w:r>
-        <w:t xml:space="preserve">It may also be the case that you’re working with very large datasets. Generally I would define this as 10+ million rows. As is outlined in this document, the 3 main players in the data analysis space are Base R,</w:t>
-      </w:r>
-      <w:r>
-        <w:t xml:space="preserve"> </w:t>
-      </w:r>
-      <w:r>
-        <w:rPr>
-          <w:rStyle w:val="VerbatimChar"/>
-        </w:rPr>
-        <w:t xml:space="preserve">Tidvyerse</w:t>
-      </w:r>
-      <w:r>
-        <w:t xml:space="preserve"> </w:t>
-      </w:r>
-      <w:r>
-        <w:t xml:space="preserve">(more specificially,</w:t>
+        <w:t xml:space="preserve">It may also be the case that you’re working with very large datasets.</w:t>
+      </w:r>
+      <w:r>
+        <w:t xml:space="preserve"> </w:t>
+      </w:r>
+      <w:r>
+        <w:t xml:space="preserve">Generally I would define this as 10+ million rows.</w:t>
+      </w:r>
+      <w:r>
+        <w:t xml:space="preserve"> </w:t>
+      </w:r>
+      <w:r>
+        <w:t xml:space="preserve">As is outlined in this document, the 3 main players in the data analysis space are Base R,</w:t>
+      </w:r>
+      <w:r>
+        <w:t xml:space="preserve"> </w:t>
+      </w:r>
+      <w:r>
+        <w:rPr>
+          <w:rStyle w:val="VerbatimChar"/>
+        </w:rPr>
+        <w:t xml:space="preserve">tidyverse</w:t>
+      </w:r>
+      <w:r>
+        <w:t xml:space="preserve"> </w:t>
+      </w:r>
+      <w:r>
+        <w:t xml:space="preserve">(more specifically,</w:t>
       </w:r>
       <w:r>
         <w:t xml:space="preserve"> </w:t>
@@ -71,7 +83,13 @@
         <w:t xml:space="preserve">data.table</w:t>
       </w:r>
       <w:r>
-        <w:t xml:space="preserve">. For a majority of things, Base R is inferior to both</w:t>
+        <w:t xml:space="preserve">.</w:t>
+      </w:r>
+      <w:r>
+        <w:t xml:space="preserve"> </w:t>
+      </w:r>
+      <w:r>
+        <w:t xml:space="preserve">For a majority of things, Base R is inferior to both</w:t>
       </w:r>
       <w:r>
         <w:t xml:space="preserve"> </w:t>
@@ -107,13 +125,13 @@
         <w:rPr>
           <w:rStyle w:val="VerbatimChar"/>
         </w:rPr>
-        <w:t xml:space="preserve">Dplyr</w:t>
-      </w:r>
-      <w:r>
-        <w:t xml:space="preserve"> </w:t>
-      </w:r>
-      <w:r>
-        <w:t xml:space="preserve">is architected for medium and smaller data, and while its very fast for everyday usage, it trades off maximum performance for ease of use and syntax compared to</w:t>
+        <w:t xml:space="preserve">dplyr</w:t>
+      </w:r>
+      <w:r>
+        <w:t xml:space="preserve"> </w:t>
+      </w:r>
+      <w:r>
+        <w:t xml:space="preserve">is architected for medium and smaller data, and while it’s very fast for everyday usage, it trades off maximum performance for ease of use and syntax compared to</w:t>
       </w:r>
       <w:r>
         <w:t xml:space="preserve"> </w:t>
@@ -125,7 +143,13 @@
         <w:t xml:space="preserve">data.table</w:t>
       </w:r>
       <w:r>
-        <w:t xml:space="preserve">. An overview of the</w:t>
+        <w:t xml:space="preserve">.</w:t>
+      </w:r>
+      <w:r>
+        <w:t xml:space="preserve"> </w:t>
+      </w:r>
+      <w:r>
+        <w:t xml:space="preserve">An overview of the</w:t>
       </w:r>
       <w:r>
         <w:t xml:space="preserve"> </w:t>
@@ -165,7 +189,7 @@
           <w:rPr>
             <w:rStyle w:val="Hyperlink"/>
           </w:rPr>
-          <w:t xml:space="preserve">this stackoverflow post</w:t>
+          <w:t xml:space="preserve">this Stack Overflow post</w:t>
         </w:r>
       </w:hyperlink>
       <w:r>
@@ -180,7 +204,19 @@
         <w:pStyle w:val="BodyText"/>
       </w:pPr>
       <w:r>
-        <w:t xml:space="preserve">You can also achieve a performance boost by running</w:t>
+        <w:t xml:space="preserve">You can also get much of</w:t>
+      </w:r>
+      <w:r>
+        <w:t xml:space="preserve"> </w:t>
+      </w:r>
+      <w:r>
+        <w:rPr>
+          <w:rStyle w:val="VerbatimChar"/>
+        </w:rPr>
+        <w:t xml:space="preserve">data.table</w:t>
+      </w:r>
+      <w:r>
+        <w:t xml:space="preserve">’s speed while keeping</w:t>
       </w:r>
       <w:r>
         <w:t xml:space="preserve"> </w:t>
@@ -195,7 +231,24 @@
         <w:t xml:space="preserve"> </w:t>
       </w:r>
       <w:r>
-        <w:t xml:space="preserve">commands on</w:t>
+        <w:t xml:space="preserve">syntax, which I find to be the best of both worlds.</w:t>
+      </w:r>
+      <w:r>
+        <w:t xml:space="preserve"> </w:t>
+      </w:r>
+      <w:hyperlink r:id="rId10">
+        <w:r>
+          <w:rPr>
+            <w:rStyle w:val="VerbatimChar"/>
+          </w:rPr>
+          <w:t xml:space="preserve">{dtplyr}</w:t>
+        </w:r>
+      </w:hyperlink>
+      <w:r>
+        <w:t xml:space="preserve"> </w:t>
+      </w:r>
+      <w:r>
+        <w:t xml:space="preserve">provides a</w:t>
       </w:r>
       <w:r>
         <w:t xml:space="preserve"> </w:t>
@@ -207,7 +260,55 @@
         <w:t xml:space="preserve">data.table</w:t>
       </w:r>
       <w:r>
-        <w:t xml:space="preserve">s, which I find to be the best of both worlds, given that a</w:t>
+        <w:t xml:space="preserve"> </w:t>
+      </w:r>
+      <w:r>
+        <w:t xml:space="preserve">backend for</w:t>
+      </w:r>
+      <w:r>
+        <w:t xml:space="preserve"> </w:t>
+      </w:r>
+      <w:r>
+        <w:rPr>
+          <w:rStyle w:val="VerbatimChar"/>
+        </w:rPr>
+        <w:t xml:space="preserve">dplyr</w:t>
+      </w:r>
+      <w:r>
+        <w:t xml:space="preserve">:</w:t>
+      </w:r>
+      <w:r>
+        <w:t xml:space="preserve"> </w:t>
+      </w:r>
+      <w:r>
+        <w:t xml:space="preserve">wrap any data frame with</w:t>
+      </w:r>
+      <w:r>
+        <w:t xml:space="preserve"> </w:t>
+      </w:r>
+      <w:r>
+        <w:rPr>
+          <w:rStyle w:val="VerbatimChar"/>
+        </w:rPr>
+        <w:t xml:space="preserve">dtplyr::lazy_dt()</w:t>
+      </w:r>
+      <w:r>
+        <w:t xml:space="preserve">, and</w:t>
+      </w:r>
+      <w:r>
+        <w:t xml:space="preserve"> </w:t>
+      </w:r>
+      <w:r>
+        <w:rPr>
+          <w:rStyle w:val="VerbatimChar"/>
+        </w:rPr>
+        <w:t xml:space="preserve">dplyr</w:t>
+      </w:r>
+      <w:r>
+        <w:t xml:space="preserve"> </w:t>
+      </w:r>
+      <w:r>
+        <w:t xml:space="preserve">verbs are translated into</w:t>
       </w:r>
       <w:r>
         <w:t xml:space="preserve"> </w:t>
@@ -222,22 +323,43 @@
         <w:t xml:space="preserve"> </w:t>
       </w:r>
       <w:r>
-        <w:t xml:space="preserve">is a special type of</w:t>
-      </w:r>
-      <w:r>
-        <w:t xml:space="preserve"> </w:t>
-      </w:r>
-      <w:r>
-        <w:rPr>
-          <w:rStyle w:val="VerbatimChar"/>
-        </w:rPr>
-        <w:t xml:space="preserve">data.frame</w:t>
-      </w:r>
-      <w:r>
-        <w:t xml:space="preserve"> </w:t>
-      </w:r>
-      <w:r>
-        <w:t xml:space="preserve">and fairly easy to convert with the</w:t>
+        <w:t xml:space="preserve">code.</w:t>
+      </w:r>
+      <w:r>
+        <w:t xml:space="preserve"> </w:t>
+      </w:r>
+      <w:r>
+        <w:t xml:space="preserve">Running</w:t>
+      </w:r>
+      <w:r>
+        <w:t xml:space="preserve"> </w:t>
+      </w:r>
+      <w:r>
+        <w:rPr>
+          <w:rStyle w:val="VerbatimChar"/>
+        </w:rPr>
+        <w:t xml:space="preserve">dplyr</w:t>
+      </w:r>
+      <w:r>
+        <w:t xml:space="preserve"> </w:t>
+      </w:r>
+      <w:r>
+        <w:t xml:space="preserve">verbs on a plain</w:t>
+      </w:r>
+      <w:r>
+        <w:t xml:space="preserve"> </w:t>
+      </w:r>
+      <w:r>
+        <w:rPr>
+          <w:rStyle w:val="VerbatimChar"/>
+        </w:rPr>
+        <w:t xml:space="preserve">data.table</w:t>
+      </w:r>
+      <w:r>
+        <w:t xml:space="preserve"> </w:t>
+      </w:r>
+      <w:r>
+        <w:t xml:space="preserve">(for example, one made with</w:t>
       </w:r>
       <w:r>
         <w:t xml:space="preserve"> </w:t>
@@ -249,37 +371,64 @@
         <w:t xml:space="preserve">as.data.table()</w:t>
       </w:r>
       <w:r>
-        <w:t xml:space="preserve"> </w:t>
-      </w:r>
-      <w:r>
-        <w:t xml:space="preserve">function. The speedup is due to</w:t>
-      </w:r>
-      <w:r>
-        <w:t xml:space="preserve"> </w:t>
-      </w:r>
-      <w:r>
-        <w:rPr>
-          <w:rStyle w:val="VerbatimChar"/>
-        </w:rPr>
-        <w:t xml:space="preserve">dplyr</w:t>
-      </w:r>
-      <w:r>
-        <w:t xml:space="preserve">’s use of the</w:t>
-      </w:r>
-      <w:r>
-        <w:t xml:space="preserve"> </w:t>
-      </w:r>
-      <w:r>
-        <w:rPr>
-          <w:rStyle w:val="VerbatimChar"/>
-        </w:rPr>
-        <w:t xml:space="preserve">data.table</w:t>
-      </w:r>
-      <w:r>
-        <w:t xml:space="preserve"> </w:t>
-      </w:r>
-      <w:r>
-        <w:t xml:space="preserve">backend and in the future this coupling should become even more natural.</w:t>
+        <w:t xml:space="preserve">) does not do this translation.</w:t>
+      </w:r>
+      <w:r>
+        <w:t xml:space="preserve"> </w:t>
+      </w:r>
+      <w:r>
+        <w:t xml:space="preserve">A</w:t>
+      </w:r>
+      <w:r>
+        <w:t xml:space="preserve"> </w:t>
+      </w:r>
+      <w:r>
+        <w:rPr>
+          <w:rStyle w:val="VerbatimChar"/>
+        </w:rPr>
+        <w:t xml:space="preserve">lazy_dt()</w:t>
+      </w:r>
+      <w:r>
+        <w:t xml:space="preserve"> </w:t>
+      </w:r>
+      <w:r>
+        <w:t xml:space="preserve">pipeline is lazy: nothing runs until you collect the result with</w:t>
+      </w:r>
+      <w:r>
+        <w:t xml:space="preserve"> </w:t>
+      </w:r>
+      <w:r>
+        <w:rPr>
+          <w:rStyle w:val="VerbatimChar"/>
+        </w:rPr>
+        <w:t xml:space="preserve">as_tibble()</w:t>
+      </w:r>
+      <w:r>
+        <w:t xml:space="preserve">,</w:t>
+      </w:r>
+      <w:r>
+        <w:t xml:space="preserve"> </w:t>
+      </w:r>
+      <w:r>
+        <w:rPr>
+          <w:rStyle w:val="VerbatimChar"/>
+        </w:rPr>
+        <w:t xml:space="preserve">as.data.table()</w:t>
+      </w:r>
+      <w:r>
+        <w:t xml:space="preserve">, or</w:t>
+      </w:r>
+      <w:r>
+        <w:t xml:space="preserve"> </w:t>
+      </w:r>
+      <w:r>
+        <w:rPr>
+          <w:rStyle w:val="VerbatimChar"/>
+        </w:rPr>
+        <w:t xml:space="preserve">collect()</w:t>
+      </w:r>
+      <w:r>
+        <w:t xml:space="preserve">.</w:t>
       </w:r>
     </w:p>
     <w:p>
@@ -378,8 +527,8 @@
         <w:t xml:space="preserve">.</w:t>
       </w:r>
     </w:p>
-    <w:bookmarkEnd w:id="10"/>
-    <w:bookmarkStart w:id="11" w:name="sec-using-downsampled-data"/>
+    <w:bookmarkEnd w:id="11"/>
+    <w:bookmarkStart w:id="12" w:name="sec-using-downsampled-data"/>
     <w:p>
       <w:pPr>
         <w:pStyle w:val="Heading2"/>
@@ -408,8 +557,8 @@
         <w:t xml:space="preserve">data that usually includes a 1% random sample stratified by any important variables, such as year or household id. This allows us to efficiently write and test our code without having to load in large, slow datasets that can cause RStudio to freeze. Be very careful to be sure which dataset you are working with and to label results output accordingly.</w:t>
       </w:r>
     </w:p>
-    <w:bookmarkEnd w:id="11"/>
-    <w:bookmarkStart w:id="12" w:name="sec-optimal-rstudio-set-up"/>
+    <w:bookmarkEnd w:id="12"/>
+    <w:bookmarkStart w:id="13" w:name="sec-optimal-rstudio-set-up"/>
     <w:p>
       <w:pPr>
         <w:pStyle w:val="Heading2"/>
@@ -554,7 +703,7 @@
         <w:t xml:space="preserve">Unfortunately RStudio often gets slow and/or freezes after hours working with big datasets. Sometimes it is much more efficient to just use Terminal / gitbash to run code and make updates in git.</w:t>
       </w:r>
     </w:p>
-    <w:bookmarkEnd w:id="12"/>
+    <w:bookmarkEnd w:id="13"/>
     <w:sectPr>
       <w:footnotePr>
         <w:numRestart w:val="eachSect"/>

</xml_diff>